<commit_message>
Corrige la conversión a .docx de negritas multilínea
El conversor trataba cada línea envuelta del markdown como un párrafo
aparte, así que las **negritas** y los blockquotes que cruzaban un salto
de línea quedaban con los asteriscos crudos en el documento del cliente.
Ahora se unen los párrafos y las citas antes de parsear.

Co-Authored-By: Claude Opus 5 <noreply@anthropic.com>
</commit_message>
<xml_diff>
--- a/docs/entregables/NEXA - Definiciones pendientes.docx
+++ b/docs/entregables/NEXA - Definiciones pendientes.docx
@@ -34,12 +34,7 @@
     </w:p>
     <w:p>
       <w:r>
-        <w:t>Arrancamos la construcción del sistema definitivo de NEXA. Para avanzar sin trabarnos ni tomar</w:t>
-      </w:r>
-    </w:p>
-    <w:p>
-      <w:r>
-        <w:t>decisiones por ustedes, necesitamos cerrar once definiciones.</w:t>
+        <w:t>Arrancamos la construcción del sistema definitivo de NEXA. Para avanzar sin trabarnos ni tomar decisiones por ustedes, necesitamos cerrar once definiciones.</w:t>
       </w:r>
     </w:p>
     <w:p>
@@ -53,12 +48,7 @@
         <w:t>por persona</w:t>
       </w:r>
       <w:r>
-        <w:t>, porque cada una la puede responder quien conoce ese sector.</w:t>
-      </w:r>
-    </w:p>
-    <w:p>
-      <w:r>
-        <w:t>Ninguna requiere preparación: son preguntas de cómo trabajan hoy.</w:t>
+        <w:t>, porque cada una la puede responder quien conoce ese sector. Ninguna requiere preparación: son preguntas de cómo trabajan hoy.</w:t>
       </w:r>
     </w:p>
     <w:p>
@@ -72,22 +62,21 @@
         <w:t>qué asumimos mientras tanto</w:t>
       </w:r>
       <w:r>
-        <w:t xml:space="preserve"> (para no frenar) y **qué archivos</w:t>
+        <w:t xml:space="preserve"> (para no frenar) y </w:t>
+      </w:r>
+      <w:r>
+        <w:rPr>
+          <w:b/>
+        </w:rPr>
+        <w:t>qué archivos necesitamos</w:t>
+      </w:r>
+      <w:r>
+        <w:t>.</w:t>
       </w:r>
     </w:p>
     <w:p>
       <w:r>
-        <w:t>necesitamos**.</w:t>
-      </w:r>
-    </w:p>
-    <w:p>
-      <w:r>
-        <w:t>Las que están marcadas ●  frenan la primera entrega. Las ○  se necesitan más adelante, pero si se</w:t>
-      </w:r>
-    </w:p>
-    <w:p>
-      <w:r>
-        <w:t>responden ahora nos ahorran rehacer trabajo.</w:t>
+        <w:t>Las que están marcadas ●  frenan la primera entrega. Las ○  se necesitan más adelante, pero si se responden ahora nos ahorran rehacer trabajo.</w:t>
       </w:r>
     </w:p>
     <w:p>
@@ -122,17 +111,7 @@
     </w:p>
     <w:p>
       <w:r>
-        <w:t>En los Excel el mismo color aparece escrito de varias formas: "Azul Oscuro", "azul oscuro",</w:t>
-      </w:r>
-    </w:p>
-    <w:p>
-      <w:r>
-        <w:t>"AZUL OSCURO"; "YUTE" y "Yute"; "Verde claro" y "Verde Claro". Para el sistema son colores</w:t>
-      </w:r>
-    </w:p>
-    <w:p>
-      <w:r>
-        <w:t>distintos, y eso rompe el catálogo.</w:t>
+        <w:t>En los Excel el mismo color aparece escrito de varias formas: "Azul Oscuro", "azul oscuro", "AZUL OSCURO"; "YUTE" y "Yute"; "Verde claro" y "Verde Claro". Para el sistema son colores distintos, y eso rompe el catálogo.</w:t>
       </w:r>
     </w:p>
     <w:p>
@@ -146,12 +125,7 @@
         <w:t>las iniciales del color</w:t>
       </w:r>
       <w:r>
-        <w:t xml:space="preserve"> (azul = AZ,</w:t>
-      </w:r>
-    </w:p>
-    <w:p>
-      <w:r>
-        <w:t>azul claro = AC, azul oscuro = AO).</w:t>
+        <w:t xml:space="preserve"> (azul = AZ, azul claro = AC, azul oscuro = AO).</w:t>
       </w:r>
     </w:p>
     <w:p>
@@ -162,18 +136,7 @@
         <w:rPr>
           <w:b/>
         </w:rPr>
-        <w:t>**¿Cuál es la lista oficial y definitiva de colores de NEXA, con el nombre exacto y las dos</w:t>
-      </w:r>
-    </w:p>
-    <w:p>
-      <w:pPr>
-        <w:ind w:left="504"/>
-      </w:pPr>
-      <w:r>
-        <w:rPr>
-          <w:b/>
-        </w:rPr>
-        <w:t>iniciales de cada uno?**</w:t>
+        <w:t>¿Cuál es la lista oficial y definitiva de colores de NEXA, con el nombre exacto y las dos iniciales de cada uno?</w:t>
       </w:r>
     </w:p>
     <w:p>
@@ -184,17 +147,7 @@
         <w:t>Por qué importa:</w:t>
       </w:r>
       <w:r>
-        <w:t xml:space="preserve"> el código de producto se arma solo a partir del color, el tipo y el proveedor</w:t>
-      </w:r>
-    </w:p>
-    <w:p>
-      <w:r>
-        <w:t>de master. Con la lista cerrada, nunca más hay un producto duplicado por una diferencia de</w:t>
-      </w:r>
-    </w:p>
-    <w:p>
-      <w:r>
-        <w:t>mayúsculas.</w:t>
+        <w:t xml:space="preserve"> el código de producto se arma solo a partir del color, el tipo y el proveedor de master. Con la lista cerrada, nunca más hay un producto duplicado por una diferencia de mayúsculas.</w:t>
       </w:r>
     </w:p>
     <w:p>
@@ -266,18 +219,7 @@
         <w:rPr>
           <w:b/>
         </w:rPr>
-        <w:t xml:space="preserve"> (se mencionó que uno de los</w:t>
-      </w:r>
-    </w:p>
-    <w:p>
-      <w:pPr>
-        <w:ind w:left="504"/>
-      </w:pPr>
-      <w:r>
-        <w:rPr>
-          <w:b/>
-        </w:rPr>
-        <w:t>colores lleva un poco menos porque es más fuerte).</w:t>
+        <w:t xml:space="preserve"> (se mencionó que uno de los colores lleva un poco menos porque es más fuerte).</w:t>
       </w:r>
     </w:p>
     <w:p>
@@ -288,12 +230,7 @@
         <w:t>Por qué importa:</w:t>
       </w:r>
       <w:r>
-        <w:t xml:space="preserve"> de este número sale el cálculo automático de cuánto master comprar por semana.</w:t>
-      </w:r>
-    </w:p>
-    <w:p>
-      <w:r>
-        <w:t>Si está mal, el sistema pide de más o de menos.</w:t>
+        <w:t xml:space="preserve"> de este número sale el cálculo automático de cuánto master comprar por semana. Si está mal, el sistema pide de más o de menos.</w:t>
       </w:r>
     </w:p>
     <w:p>
@@ -309,12 +246,7 @@
     </w:p>
     <w:p>
       <w:r>
-        <w:t>Hoy lo asigna a mano el encargado de producción, cuando cambia el material o la inyección. En la</w:t>
-      </w:r>
-    </w:p>
-    <w:p>
-      <w:r>
-        <w:t>reunión se planteó automatizarlo.</w:t>
+        <w:t>Hoy lo asigna a mano el encargado de producción, cuando cambia el material o la inyección. En la reunión se planteó automatizarlo.</w:t>
       </w:r>
     </w:p>
     <w:p>
@@ -325,18 +257,7 @@
         <w:rPr>
           <w:b/>
         </w:rPr>
-        <w:t>**¿Puede el sistema generar el número de partida solo, cada vez que arranca una producción con</w:t>
-      </w:r>
-    </w:p>
-    <w:p>
-      <w:pPr>
-        <w:ind w:left="504"/>
-      </w:pPr>
-      <w:r>
-        <w:rPr>
-          <w:b/>
-        </w:rPr>
-        <w:t>una combinación nueva de material y color? ¿O hay casos en que tiene que poder forzarse a mano?**</w:t>
+        <w:t>¿Puede el sistema generar el número de partida solo, cada vez que arranca una producción con una combinación nueva de material y color? ¿O hay casos en que tiene que poder forzarse a mano?</w:t>
       </w:r>
     </w:p>
     <w:p>
@@ -347,12 +268,7 @@
         <w:t>Por qué importa:</w:t>
       </w:r>
       <w:r>
-        <w:t xml:space="preserve"> es la pieza central de la trazabilidad. Si se tipea a mano, tarde o temprano se</w:t>
-      </w:r>
-    </w:p>
-    <w:p>
-      <w:r>
-        <w:t>repite o se saltea un número, y se pierde el rastro.</w:t>
+        <w:t xml:space="preserve"> es la pieza central de la trazabilidad. Si se tipea a mano, tarde o temprano se repite o se saltea un número, y se pierde el rastro.</w:t>
       </w:r>
     </w:p>
     <w:p>
@@ -402,11 +318,6 @@
       </w:r>
     </w:p>
     <w:p>
-      <w:r>
-        <w:t>&gt;</w:t>
-      </w:r>
-    </w:p>
-    <w:p>
       <w:pPr>
         <w:ind w:left="504"/>
       </w:pPr>
@@ -414,18 +325,7 @@
         <w:rPr>
           <w:b/>
         </w:rPr>
-        <w:t>**Y si lo llenan a mano: ¿prefieren cargar el pedido directamente en el sistema nuevo, o que el</w:t>
-      </w:r>
-    </w:p>
-    <w:p>
-      <w:pPr>
-        <w:ind w:left="504"/>
-      </w:pPr>
-      <w:r>
-        <w:rPr>
-          <w:b/>
-        </w:rPr>
-        <w:t>sistema importe el Excel que ya generan?**</w:t>
+        <w:t>Y si lo llenan a mano: ¿prefieren cargar el pedido directamente en el sistema nuevo, o que el sistema importe el Excel que ya generan?</w:t>
       </w:r>
     </w:p>
     <w:p>
@@ -436,17 +336,7 @@
         <w:t>Por qué importa:</w:t>
       </w:r>
       <w:r>
-        <w:t xml:space="preserve"> si cargan directo en el sistema, el pedido chequea stock al instante y dispara</w:t>
-      </w:r>
-    </w:p>
-    <w:p>
-      <w:r>
-        <w:t>la producción solo. Si seguimos con el Excel, eso llega con demora y hay doble carga. Nuestra</w:t>
-      </w:r>
-    </w:p>
-    <w:p>
-      <w:r>
-        <w:t>recomendación es carga directa, pero la decisión es de ustedes y la respetamos.</w:t>
+        <w:t xml:space="preserve"> si cargan directo en el sistema, el pedido chequea stock al instante y dispara la producción solo. Si seguimos con el Excel, eso llega con demora y hay doble carga. Nuestra recomendación es carga directa, pero la decisión es de ustedes y la respetamos.</w:t>
       </w:r>
     </w:p>
     <w:p>
@@ -462,17 +352,7 @@
     </w:p>
     <w:p>
       <w:r>
-        <w:t>En el Excel de ventas es muy común ver el color como "Gris oscuro y amarillo" o "Negro, blanco y</w:t>
-      </w:r>
-    </w:p>
-    <w:p>
-      <w:r>
-        <w:t>rojo" en una sola celda, sin decir cuánto de cada uno. De 100 renglones que importamos, sólo 22</w:t>
-      </w:r>
-    </w:p>
-    <w:p>
-      <w:r>
-        <w:t>se pudieron vincular a un producto concreto.</w:t>
+        <w:t>En el Excel de ventas es muy común ver el color como "Gris oscuro y amarillo" o "Negro, blanco y rojo" en una sola celda, sin decir cuánto de cada uno. De 100 renglones que importamos, sólo 22 se pudieron vincular a un producto concreto.</w:t>
       </w:r>
     </w:p>
     <w:p>
@@ -483,23 +363,7 @@
         <w:rPr>
           <w:b/>
         </w:rPr>
-        <w:t>**Cuando un pedido lleva varios colores: ¿son varios renglones distintos (tantas baldosas de</w:t>
-      </w:r>
-    </w:p>
-    <w:p>
-      <w:pPr>
-        <w:ind w:left="504"/>
-      </w:pPr>
-      <w:r>
-        <w:rPr>
-          <w:b/>
-        </w:rPr>
-        <w:t>cada color), o es un producto combinado que se vende así?**</w:t>
-      </w:r>
-    </w:p>
-    <w:p>
-      <w:r>
-        <w:t>&gt;</w:t>
+        <w:t>Cuando un pedido lleva varios colores: ¿son varios renglones distintos (tantas baldosas de cada color), o es un producto combinado que se vende así?</w:t>
       </w:r>
     </w:p>
     <w:p>
@@ -521,12 +385,7 @@
         <w:t>Por qué importa:</w:t>
       </w:r>
       <w:r>
-        <w:t xml:space="preserve"> si el sistema no sabe qué producto exacto lleva el pedido, no puede chequear</w:t>
-      </w:r>
-    </w:p>
-    <w:p>
-      <w:r>
-        <w:t>stock ni disparar la producción. Es el corazón del circuito.</w:t>
+        <w:t xml:space="preserve"> si el sistema no sabe qué producto exacto lleva el pedido, no puede chequear stock ni disparar la producción. Es el corazón del circuito.</w:t>
       </w:r>
     </w:p>
     <w:p>
@@ -542,12 +401,7 @@
     </w:p>
     <w:p>
       <w:r>
-        <w:t>La hoja CLIENTES del Excel está vacía. Del Excel de ventas pudimos sacar unos 60 nombres, pero</w:t>
-      </w:r>
-    </w:p>
-    <w:p>
-      <w:r>
-        <w:t>entendemos que son alrededor de 360.</w:t>
+        <w:t>La hoja CLIENTES del Excel está vacía. Del Excel de ventas pudimos sacar unos 60 nombres, pero entendemos que son alrededor de 360.</w:t>
       </w:r>
     </w:p>
     <w:p>
@@ -569,12 +423,7 @@
         <w:t>Por qué importa:</w:t>
       </w:r>
       <w:r>
-        <w:t xml:space="preserve"> sin eso hay que cargar cada cliente a mano la primera vez que compra, y no se</w:t>
-      </w:r>
-    </w:p>
-    <w:p>
-      <w:r>
-        <w:t>pueden emitir remitos con los datos correctos.</w:t>
+        <w:t xml:space="preserve"> sin eso hay que cargar cada cliente a mano la primera vez que compra, y no se pueden emitir remitos con los datos correctos.</w:t>
       </w:r>
     </w:p>
     <w:p>
@@ -590,12 +439,7 @@
     </w:p>
     <w:p>
       <w:r>
-        <w:t>Hoy el Excel registra cuánto pagó el cliente, cuánto falta y la forma de pago, pero la facturación</w:t>
-      </w:r>
-    </w:p>
-    <w:p>
-      <w:r>
-        <w:t>va por un sistema aparte.</w:t>
+        <w:t>Hoy el Excel registra cuánto pagó el cliente, cuánto falta y la forma de pago, pero la facturación va por un sistema aparte.</w:t>
       </w:r>
     </w:p>
     <w:p>
@@ -606,18 +450,7 @@
         <w:rPr>
           <w:b/>
         </w:rPr>
-        <w:t>**¿El sistema tiene que frenar un despacho si el pedido no está cobrado, o eso lo controla</w:t>
-      </w:r>
-    </w:p>
-    <w:p>
-      <w:pPr>
-        <w:ind w:left="504"/>
-      </w:pPr>
-      <w:r>
-        <w:rPr>
-          <w:b/>
-        </w:rPr>
-        <w:t>administración por fuera?**</w:t>
+        <w:t>¿El sistema tiene que frenar un despacho si el pedido no está cobrado, o eso lo controla administración por fuera?</w:t>
       </w:r>
     </w:p>
     <w:p>
@@ -652,12 +485,7 @@
     </w:p>
     <w:p>
       <w:r>
-        <w:t>Este es el que más nos preocupa. En la hoja de stock, 90 de los 94 productos tienen cargada la</w:t>
-      </w:r>
-    </w:p>
-    <w:p>
-      <w:r>
-        <w:t xml:space="preserve">columna MÍNIMO (con valores como 200, 500, 1500) y </w:t>
+        <w:t xml:space="preserve">Este es el que más nos preocupa. En la hoja de stock, 90 de los 94 productos tienen cargada la columna MÍNIMO (con valores como 200, 500, 1500) y </w:t>
       </w:r>
       <w:r>
         <w:rPr>
@@ -680,12 +508,7 @@
         <w:t>70 de los 94 productos le aparecen al sistema en rojo</w:t>
       </w:r>
       <w:r>
-        <w:t>. Un semáforo donde</w:t>
-      </w:r>
-    </w:p>
-    <w:p>
-      <w:r>
-        <w:t>casi todo está en rojo no sirve para decidir nada.</w:t>
+        <w:t>. Un semáforo donde casi todo está en rojo no sirve para decidir nada.</w:t>
       </w:r>
     </w:p>
     <w:p>
@@ -696,23 +519,7 @@
         <w:rPr>
           <w:b/>
         </w:rPr>
-        <w:t>**Esos valores (500, 1500), ¿son el mínimo que nunca hay que perforar, o son en realidad el</w:t>
-      </w:r>
-    </w:p>
-    <w:p>
-      <w:pPr>
-        <w:ind w:left="504"/>
-      </w:pPr>
-      <w:r>
-        <w:rPr>
-          <w:b/>
-        </w:rPr>
-        <w:t>objetivo de stock que quieren tener?**</w:t>
-      </w:r>
-    </w:p>
-    <w:p>
-      <w:r>
-        <w:t>&gt;</w:t>
+        <w:t>Esos valores (500, 1500), ¿son el mínimo que nunca hay que perforar, o son en realidad el objetivo de stock que quieren tener?</w:t>
       </w:r>
     </w:p>
     <w:p>
@@ -728,17 +535,7 @@
     </w:p>
     <w:p>
       <w:r>
-        <w:t>Entendemos que la línea es nueva y estos números se están calibrando. No hace falta que sean</w:t>
-      </w:r>
-    </w:p>
-    <w:p>
-      <w:r>
-        <w:t>definitivos: alcanza con un criterio (por ejemplo, "el mínimo es una semana de venta") y los</w:t>
-      </w:r>
-    </w:p>
-    <w:p>
-      <w:r>
-        <w:t>vamos ajustando.</w:t>
+        <w:t>Entendemos que la línea es nueva y estos números se están calibrando. No hace falta que sean definitivos: alcanza con un criterio (por ejemplo, "el mínimo es una semana de venta") y los vamos ajustando.</w:t>
       </w:r>
     </w:p>
     <w:p>
@@ -754,10 +551,8 @@
     </w:p>
     <w:p>
       <w:r>
-        <w:t>El catálogo no tiene cargada la cantidad por caja. Del Excel de cálculo sacamos que la caja de</w:t>
+        <w:t xml:space="preserve">El catálogo no tiene cargada la cantidad por caja. Del Excel de cálculo sacamos que la caja de </w:t>
       </w:r>
-    </w:p>
-    <w:p>
       <w:r>
         <w:rPr>
           <w:b/>
@@ -785,18 +580,7 @@
         <w:rPr>
           <w:b/>
         </w:rPr>
-        <w:t>**¿Es siempre así, o varía según el producto? ¿Y los accesorios (bordes, esquineros, rampas)</w:t>
-      </w:r>
-    </w:p>
-    <w:p>
-      <w:pPr>
-        <w:ind w:left="504"/>
-      </w:pPr>
-      <w:r>
-        <w:rPr>
-          <w:b/>
-        </w:rPr>
-        <w:t>cómo se embalan?**</w:t>
+        <w:t>¿Es siempre así, o varía según el producto? ¿Y los accesorios (bordes, esquineros, rampas) cómo se embalan?</w:t>
       </w:r>
     </w:p>
     <w:p>
@@ -807,12 +591,7 @@
         <w:t>Por qué importa:</w:t>
       </w:r>
       <w:r>
-        <w:t xml:space="preserve"> la etiqueta de la caja lleva la cantidad, y esa cantidad es la que descuenta</w:t>
-      </w:r>
-    </w:p>
-    <w:p>
-      <w:r>
-        <w:t>del stock cuando se piquea. Si está mal, el stock queda mal.</w:t>
+        <w:t xml:space="preserve"> la etiqueta de la caja lleva la cantidad, y esa cantidad es la que descuenta del stock cuando se piquea. Si está mal, el stock queda mal.</w:t>
       </w:r>
     </w:p>
     <w:p>
@@ -828,12 +607,7 @@
     </w:p>
     <w:p>
       <w:r>
-        <w:t>En el histórico de producción aparecen las inyectoras 6 y 8, pero entendemos que NEXA trabaja con</w:t>
-      </w:r>
-    </w:p>
-    <w:p>
-      <w:r>
-        <w:t>una sola.</w:t>
+        <w:t>En el histórico de producción aparecen las inyectoras 6 y 8, pero entendemos que NEXA trabaja con una sola.</w:t>
       </w:r>
     </w:p>
     <w:p>
@@ -879,12 +653,7 @@
     </w:p>
     <w:p>
       <w:r>
-        <w:t>El procedimiento define el código de barras en cuatro bloques: 3 dígitos de producto inyectado,</w:t>
-      </w:r>
-    </w:p>
-    <w:p>
-      <w:r>
-        <w:t>4 de materia prima, 8 de proveedor y certificado, 12 de lote.</w:t>
+        <w:t>El procedimiento define el código de barras en cuatro bloques: 3 dígitos de producto inyectado, 4 de materia prima, 8 de proveedor y certificado, 12 de lote.</w:t>
       </w:r>
     </w:p>
     <w:p>
@@ -895,29 +664,7 @@
         <w:rPr>
           <w:b/>
         </w:rPr>
-        <w:t>**Los 3 primeros dígitos identifican el producto inyectado. Pero una misma bolsa de materia</w:t>
-      </w:r>
-    </w:p>
-    <w:p>
-      <w:pPr>
-        <w:ind w:left="504"/>
-      </w:pPr>
-      <w:r>
-        <w:rPr>
-          <w:b/>
-        </w:rPr>
-        <w:t>prima puede usarse para varios productos y colores distintos. ¿Cómo se resuelve eso hoy? ¿Se</w:t>
-      </w:r>
-    </w:p>
-    <w:p>
-      <w:pPr>
-        <w:ind w:left="504"/>
-      </w:pPr>
-      <w:r>
-        <w:rPr>
-          <w:b/>
-        </w:rPr>
-        <w:t>etiqueta la bolsa pensando en el producto al que está destinada?**</w:t>
+        <w:t>Los 3 primeros dígitos identifican el producto inyectado. Pero una misma bolsa de materia prima puede usarse para varios productos y colores distintos. ¿Cómo se resuelve eso hoy? ¿Se etiqueta la bolsa pensando en el producto al que está destinada?</w:t>
       </w:r>
     </w:p>
     <w:p>
@@ -928,12 +675,7 @@
         <w:t>Por qué importa:</w:t>
       </w:r>
       <w:r>
-        <w:t xml:space="preserve"> queremos que el sistema valide el código al leerlo y avise si está mal armado,</w:t>
-      </w:r>
-    </w:p>
-    <w:p>
-      <w:r>
-        <w:t>en vez de guardarlo con un error silencioso.</w:t>
+        <w:t xml:space="preserve"> queremos que el sistema valide el código al leerlo y avise si está mal armado, en vez de guardarlo con un error silencioso.</w:t>
       </w:r>
     </w:p>
     <w:p>
@@ -966,12 +708,7 @@
         <w:t>Todos son reversibles</w:t>
       </w:r>
       <w:r>
-        <w:t xml:space="preserve"> y los cambiamos apenas nos</w:t>
-      </w:r>
-    </w:p>
-    <w:p>
-      <w:r>
-        <w:t>confirmen:</w:t>
+        <w:t xml:space="preserve"> y los cambiamos apenas nos confirmen:</w:t>
       </w:r>
     </w:p>
     <w:tbl>
@@ -1511,12 +1248,7 @@
     </w:p>
     <w:p>
       <w:r>
-        <w:t xml:space="preserve">  (por ejemplo, que se lleven los pisos y queden las rampas para la semana siguiente). El pedido</w:t>
-      </w:r>
-    </w:p>
-    <w:p>
-      <w:r>
-        <w:t xml:space="preserve">  queda abierto con lo que falta.</w:t>
+        <w:t>(por ejemplo, que se lleven los pisos y queden las rampas para la semana siguiente). El pedido queda abierto con lo que falta.</w:t>
       </w:r>
     </w:p>
     <w:p>
@@ -1535,7 +1267,7 @@
     </w:p>
     <w:p>
       <w:r>
-        <w:t xml:space="preserve">  despacho, y otro en el control final. Queda registro de quién, cuándo y qué.</w:t>
+        <w:t>despacho, y otro en el control final. Queda registro de quién, cuándo y qué.</w:t>
       </w:r>
     </w:p>
     <w:p>
@@ -1568,12 +1300,7 @@
     </w:p>
     <w:p>
       <w:r>
-        <w:t xml:space="preserve">  recibió el cliente, en los dos sentidos: dado un reclamo, qué lote se usó; y dado un lote</w:t>
-      </w:r>
-    </w:p>
-    <w:p>
-      <w:r>
-        <w:t xml:space="preserve">  fallado, qué cajas salieron y a qué clientes.</w:t>
+        <w:t>recibió el cliente, en los dos sentidos: dado un reclamo, qué lote se usó; y dado un lote fallado, qué cajas salieron y a qué clientes.</w:t>
       </w:r>
     </w:p>
     <w:p>
@@ -1592,7 +1319,7 @@
     </w:p>
     <w:p>
       <w:r>
-        <w:t xml:space="preserve">  abajo nadie ve precios.</w:t>
+        <w:t>abajo nadie ve precios.</w:t>
       </w:r>
     </w:p>
     <w:sectPr>

</xml_diff>

<commit_message>
Decisión: ciclo libre (no por día) + docs al día
Matías decidió mantener el diseño del 16/09 (ciclo libre) en vez de pasar a
carga diaria — es una decisión interna, no se le devuelve como pregunta al
cliente. Los indicadores diarios que pidieron se resuelven vía la partida
(agrupa la continuidad entre ciclos del mismo color) y el tablero por
período, no por corte de día calendario.

Actualizado docs/06-comentarios-produccion.md (§3.2 con la decisión y el
porqué, §6 y §7 marcados "hecho" ya que el menú lateral y el alta de
producto desde pedidos se construyeron antes de esta decisión) y el
documento del cliente: se sacó la pregunta 12 (ya no se le pregunta) y se
suma a "Lo que ya está resuelto", con la salvedad de que pueden pedir
revisarlo si insisten en el corte diario.

Co-Authored-By: Claude Sonnet 5 <noreply@anthropic.com>
</commit_message>
<xml_diff>
--- a/docs/entregables/NEXA - Definiciones pendientes.docx
+++ b/docs/entregables/NEXA - Definiciones pendientes.docx
@@ -34,7 +34,7 @@
     </w:p>
     <w:p>
       <w:r>
-        <w:t>Arrancamos la construcción del sistema definitivo de NEXA. Para avanzar sin trabarnos ni tomar decisiones por ustedes, necesitamos cerrar once definiciones.</w:t>
+        <w:t>Arrancamos la construcción del sistema definitivo de NEXA. Para avanzar sin trabarnos ni tomar decisiones por ustedes, necesitamos cerrar diez definiciones.</w:t>
       </w:r>
     </w:p>
     <w:p>
@@ -269,67 +269,6 @@
       </w:r>
       <w:r>
         <w:t xml:space="preserve"> es la pieza central de la trazabilidad. Si se tipea a mano, tarde o temprano se repite o se saltea un número, y se pierde el rastro.</w:t>
-      </w:r>
-    </w:p>
-    <w:p>
-      <w:pPr>
-        <w:pStyle w:val="Heading2"/>
-      </w:pPr>
-      <w:r>
-        <w:rPr>
-          <w:color w:val="1A1A1A"/>
-        </w:rPr>
-        <w:t>●  12. La carga de producción, ¿por día o por ciclo libre?</w:t>
-      </w:r>
-    </w:p>
-    <w:p>
-      <w:r>
-        <w:t xml:space="preserve">En la reunión del 16/09 se había definido que el operario carga </w:t>
-      </w:r>
-      <w:r>
-        <w:rPr>
-          <w:b/>
-        </w:rPr>
-        <w:t>inicio y fin de un ciclo de inyección</w:t>
-      </w:r>
-      <w:r>
-        <w:t>, sin importar si eso abarca uno o varios días — así se puede saber exactamente cuánto se produjo entre dos cambios de matriz o de color.</w:t>
-      </w:r>
-    </w:p>
-    <w:p>
-      <w:r>
-        <w:t xml:space="preserve">Ahora nos llegó, a través de Ignacio, un pedido distinto: que la colada, las piezas producidas y las descartadas se carguen </w:t>
-      </w:r>
-      <w:r>
-        <w:rPr>
-          <w:b/>
-        </w:rPr>
-        <w:t>día por día</w:t>
-      </w:r>
-      <w:r>
-        <w:t>, como indicadores diarios.</w:t>
-      </w:r>
-    </w:p>
-    <w:p>
-      <w:pPr>
-        <w:ind w:left="504"/>
-      </w:pPr>
-      <w:r>
-        <w:rPr>
-          <w:b/>
-        </w:rPr>
-        <w:t>¿Cuál de los dos formatos prefieren: seguir por ciclo libre (inicio/fin sin atarlo al día) o pasar a una carga diaria? Son dos diseños distintos, no se pueden mezclar a medias.</w:t>
-      </w:r>
-    </w:p>
-    <w:p>
-      <w:r>
-        <w:rPr>
-          <w:i/>
-        </w:rPr>
-        <w:t>Por qué importa:</w:t>
-      </w:r>
-      <w:r>
-        <w:t xml:space="preserve"> de esto depende cómo se construye toda la pantalla de carga de producción (Etapa 3), así que conviene cerrarlo antes de empezar esa parte.</w:t>
       </w:r>
     </w:p>
     <w:p>
@@ -1353,6 +1292,25 @@
         <w:t>abajo nadie ve precios.</w:t>
       </w:r>
     </w:p>
+    <w:p>
+      <w:pPr>
+        <w:pStyle w:val="ListBullet"/>
+      </w:pPr>
+      <w:r>
+        <w:rPr>
+          <w:b/>
+        </w:rPr>
+        <w:t>Carga de producción por ciclo, no por día.</w:t>
+      </w:r>
+      <w:r>
+        <w:t xml:space="preserve"> El operario sigue cargando inicio y fin de cada</w:t>
+      </w:r>
+    </w:p>
+    <w:p>
+      <w:r>
+        <w:t>ciclo de inyección sin atarlo al corte del día, como se había definido con Eduardo — un color que sigue tres días es un solo ciclo. Los indicadores diarios de material y descarte que pidieron se resuelven con la partida, que agrupa la continuidad entre ciclos del mismo color, y con el tablero por período. Si prefieren el corte diario estricto, avísennos y lo revisamos.</w:t>
+      </w:r>
+    </w:p>
     <w:sectPr>
       <w:pgSz w:w="12240" w:h="15840"/>
       <w:pgMar w:top="1440" w:right="1800" w:bottom="1440" w:left="1800" w:header="720" w:footer="720" w:gutter="0"/>

</xml_diff>

<commit_message>
Corrige la decisión: por día, no ciclo libre
Matías revisó la explicación y cambió de decisión antes de que se
construyera nada sobre la anterior. docs/06-comentarios-produccion.md y el
documento del cliente quedan al día: el operario cierra el ciclo al final
de cada jornada aunque siga con el mismo color, con continuidad entre días
vía golpesInicio=golpesFin del día anterior y la misma partida — así salen
los indicadores diarios que pidió el cliente.

No afecta el cambio de schema de ciclo_pedido (N:M) recién agregado, que
sirve igual para las dos opciones.

Co-Authored-By: Claude Sonnet 5 <noreply@anthropic.com>
</commit_message>
<xml_diff>
--- a/docs/entregables/NEXA - Definiciones pendientes.docx
+++ b/docs/entregables/NEXA - Definiciones pendientes.docx
@@ -1300,15 +1300,15 @@
         <w:rPr>
           <w:b/>
         </w:rPr>
-        <w:t>Carga de producción por ciclo, no por día.</w:t>
+        <w:t>Carga de producción por día.</w:t>
       </w:r>
       <w:r>
-        <w:t xml:space="preserve"> El operario sigue cargando inicio y fin de cada</w:t>
+        <w:t xml:space="preserve"> El operario cierra el ciclo al final de cada jornada, aunque</w:t>
       </w:r>
     </w:p>
     <w:p>
       <w:r>
-        <w:t>ciclo de inyección sin atarlo al corte del día, como se había definido con Eduardo — un color que sigue tres días es un solo ciclo. Los indicadores diarios de material y descarte que pidieron se resuelven con la partida, que agrupa la continuidad entre ciclos del mismo color, y con el tablero por período. Si prefieren el corte diario estricto, avísennos y lo revisamos.</w:t>
+        <w:t>siga con el mismo color al día siguiente — así la colada, el descarte y el consumo de material salen por día, como pidieron. No se pierde la continuidad: el día siguiente arranca desde donde quedó el anterior, y los dos quedan bajo la misma partida.</w:t>
       </w:r>
     </w:p>
     <w:sectPr>

</xml_diff>

<commit_message>
Informe de avance Ronda 2 + testing punta a punta
Testing integral contra el sistema real (nexa-erp-two.vercel.app) con los
usuarios reales de cada rol: control de acceso por rol/URL directa, ciclo
completo de pedido (alta → reserva → armado → listo → entregado, con
movimiento de salida real), cancelación (libera reserva sin tocar stock),
edición de pedido, corrección manual de stock, y dos ciclos de producción
en días seguidos verificando la continuidad de partida (golpesInicio
sugerido) y el movimiento de entrada real. Todo probado también en mobile.
Sin hallazgos que bloqueen el uso; datos de prueba cargados y borrados con
un cliente ficticio, sin dejar residuos en los datos reales.

Marca la pregunta 3 (número de partida) como resuelta en "Definiciones
pendientes", ya que quedó implementada en este release.

Co-Authored-By: Claude Sonnet 5 <noreply@anthropic.com>
</commit_message>
<xml_diff>
--- a/docs/entregables/NEXA - Definiciones pendientes.docx
+++ b/docs/entregables/NEXA - Definiciones pendientes.docx
@@ -4,12 +4,9 @@
   <w:body>
     <w:p>
       <w:pPr>
-        <w:pStyle w:val="Title"/>
+        <w:pStyle w:val="Heading1"/>
       </w:pPr>
       <w:r>
-        <w:rPr>
-          <w:color w:val="1A1A1A"/>
-        </w:rPr>
         <w:t>NEXA — Definiciones pendientes</w:t>
       </w:r>
     </w:p>
@@ -25,16 +22,8 @@
       </w:r>
     </w:p>
     <w:p>
-      <w:pPr>
-        <w:jc w:val="center"/>
-      </w:pPr>
       <w:r>
-        <w:t>________________________________________________________________________</w:t>
-      </w:r>
-    </w:p>
-    <w:p>
-      <w:r>
-        <w:t>Arrancamos la construcción del sistema definitivo de NEXA. Para avanzar sin trabarnos ni tomar decisiones por ustedes, necesitamos cerrar diez definiciones.</w:t>
+        <w:t>Arrancamos la construcción del sistema definitivo de NEXA. Para avanzar sin trabarnos ni tomar decisiones por ustedes, necesitamos cerrar nueve definiciones.</w:t>
       </w:r>
     </w:p>
     <w:p>
@@ -76,26 +65,7 @@
     </w:p>
     <w:p>
       <w:r>
-        <w:t>Las que están marcadas ●  frenan la primera entrega. Las ○  se necesitan más adelante, pero si se responden ahora nos ahorran rehacer trabajo.</w:t>
-      </w:r>
-    </w:p>
-    <w:p>
-      <w:pPr>
-        <w:jc w:val="center"/>
-      </w:pPr>
-      <w:r>
-        <w:t>________________________________________________________________________</w:t>
-      </w:r>
-    </w:p>
-    <w:p>
-      <w:pPr>
-        <w:pStyle w:val="Heading1"/>
-      </w:pPr>
-      <w:r>
-        <w:rPr>
-          <w:color w:val="1A1A1A"/>
-        </w:rPr>
-        <w:t>Eduardo González — Supervisor general</w:t>
+        <w:t>Las que están marcadas 🔴 frenan la primera entrega. Las 🟡 se necesitan más adelante, pero si se responden ahora nos ahorran rehacer trabajo.</w:t>
       </w:r>
     </w:p>
     <w:p>
@@ -103,10 +73,15 @@
         <w:pStyle w:val="Heading2"/>
       </w:pPr>
       <w:r>
-        <w:rPr>
-          <w:color w:val="1A1A1A"/>
-        </w:rPr>
-        <w:t>●  1. La lista oficial de colores</w:t>
+        <w:t>Eduardo González — Supervisor general</w:t>
+      </w:r>
+    </w:p>
+    <w:p>
+      <w:pPr>
+        <w:pStyle w:val="Heading3"/>
+      </w:pPr>
+      <w:r>
+        <w:t>🔴 1. La lista oficial de colores</w:t>
       </w:r>
     </w:p>
     <w:p>
@@ -130,13 +105,18 @@
     </w:p>
     <w:p>
       <w:pPr>
-        <w:ind w:left="504"/>
+        <w:pStyle w:val="IntenseQuote"/>
       </w:pPr>
       <w:r>
-        <w:rPr>
-          <w:b/>
-        </w:rPr>
-        <w:t>¿Cuál es la lista oficial y definitiva de colores de NEXA, con el nombre exacto y las dos iniciales de cada uno?</w:t>
+        <w:t>**¿Cuál es la lista oficial y definitiva de colores de NEXA, con el nombre exacto y las dos</w:t>
+      </w:r>
+    </w:p>
+    <w:p>
+      <w:pPr>
+        <w:pStyle w:val="IntenseQuote"/>
+      </w:pPr>
+      <w:r>
+        <w:t>iniciales de cada uno?**</w:t>
       </w:r>
     </w:p>
     <w:p>
@@ -152,13 +132,10 @@
     </w:p>
     <w:p>
       <w:pPr>
-        <w:pStyle w:val="Heading2"/>
+        <w:pStyle w:val="Heading3"/>
       </w:pPr>
       <w:r>
-        <w:rPr>
-          <w:color w:val="1A1A1A"/>
-        </w:rPr>
-        <w:t>○  2. Cuánto master por kilo de materia prima</w:t>
+        <w:t>🟡 2. Cuánto master por kilo de materia prima</w:t>
       </w:r>
     </w:p>
     <w:p>
@@ -207,7 +184,7 @@
     </w:p>
     <w:p>
       <w:pPr>
-        <w:ind w:left="504"/>
+        <w:pStyle w:val="IntenseQuote"/>
       </w:pPr>
       <w:r>
         <w:rPr>
@@ -216,10 +193,15 @@
         <w:t>¿Cuál de los dos es el correcto? ¿Y varía según el color?</w:t>
       </w:r>
       <w:r>
-        <w:rPr>
-          <w:b/>
-        </w:rPr>
-        <w:t xml:space="preserve"> (se mencionó que uno de los colores lleva un poco menos porque es más fuerte).</w:t>
+        <w:t xml:space="preserve"> (se mencionó que uno de los</w:t>
+      </w:r>
+    </w:p>
+    <w:p>
+      <w:pPr>
+        <w:pStyle w:val="IntenseQuote"/>
+      </w:pPr>
+      <w:r>
+        <w:t>colores lleva un poco menos porque es más fuerte).</w:t>
       </w:r>
     </w:p>
     <w:p>
@@ -238,67 +220,15 @@
         <w:pStyle w:val="Heading2"/>
       </w:pPr>
       <w:r>
-        <w:rPr>
-          <w:color w:val="1A1A1A"/>
-        </w:rPr>
-        <w:t>○  3. El número de partida NEXA, ¿lo pone una persona o lo genera el sistema?</w:t>
-      </w:r>
-    </w:p>
-    <w:p>
-      <w:r>
-        <w:t>Hoy lo asigna a mano el encargado de producción, cuando cambia el material o la inyección. En la reunión se planteó automatizarlo.</w:t>
-      </w:r>
-    </w:p>
-    <w:p>
-      <w:pPr>
-        <w:ind w:left="504"/>
-      </w:pPr>
-      <w:r>
-        <w:rPr>
-          <w:b/>
-        </w:rPr>
-        <w:t>¿Puede el sistema generar el número de partida solo, cada vez que arranca una producción con una combinación nueva de material y color? ¿O hay casos en que tiene que poder forzarse a mano?</w:t>
-      </w:r>
-    </w:p>
-    <w:p>
-      <w:r>
-        <w:rPr>
-          <w:i/>
-        </w:rPr>
-        <w:t>Por qué importa:</w:t>
-      </w:r>
-      <w:r>
-        <w:t xml:space="preserve"> es la pieza central de la trazabilidad. Si se tipea a mano, tarde o temprano se repite o se saltea un número, y se pierde el rastro.</w:t>
-      </w:r>
-    </w:p>
-    <w:p>
-      <w:pPr>
-        <w:jc w:val="center"/>
-      </w:pPr>
-      <w:r>
-        <w:t>________________________________________________________________________</w:t>
-      </w:r>
-    </w:p>
-    <w:p>
-      <w:pPr>
-        <w:pStyle w:val="Heading1"/>
-      </w:pPr>
-      <w:r>
-        <w:rPr>
-          <w:color w:val="1A1A1A"/>
-        </w:rPr>
         <w:t>Alejandra Antón — Administración y ventas</w:t>
       </w:r>
     </w:p>
     <w:p>
       <w:pPr>
-        <w:pStyle w:val="Heading2"/>
+        <w:pStyle w:val="Heading3"/>
       </w:pPr>
       <w:r>
-        <w:rPr>
-          <w:color w:val="1A1A1A"/>
-        </w:rPr>
-        <w:t>●  5. Pedidos con varios colores en un mismo renglón</w:t>
+        <w:t>🔴 5. Pedidos con varios colores en un mismo renglón</w:t>
       </w:r>
     </w:p>
     <w:p>
@@ -308,18 +238,28 @@
     </w:p>
     <w:p>
       <w:pPr>
-        <w:ind w:left="504"/>
+        <w:pStyle w:val="IntenseQuote"/>
       </w:pPr>
       <w:r>
-        <w:rPr>
-          <w:b/>
-        </w:rPr>
-        <w:t>Cuando un pedido lleva varios colores: ¿son varios renglones distintos (tantas baldosas de cada color), o es un producto combinado que se vende así?</w:t>
+        <w:t>**Cuando un pedido lleva varios colores: ¿son varios renglones distintos (tantas baldosas de</w:t>
       </w:r>
     </w:p>
     <w:p>
       <w:pPr>
-        <w:ind w:left="504"/>
+        <w:pStyle w:val="IntenseQuote"/>
+      </w:pPr>
+      <w:r>
+        <w:t>cada color), o es un producto combinado que se vende así?**</w:t>
+      </w:r>
+    </w:p>
+    <w:p>
+      <w:pPr>
+        <w:pStyle w:val="IntenseQuote"/>
+      </w:pPr>
+    </w:p>
+    <w:p>
+      <w:pPr>
+        <w:pStyle w:val="IntenseQuote"/>
       </w:pPr>
       <w:r>
         <w:rPr>
@@ -341,13 +281,10 @@
     </w:p>
     <w:p>
       <w:pPr>
-        <w:pStyle w:val="Heading2"/>
+        <w:pStyle w:val="Heading3"/>
       </w:pPr>
       <w:r>
-        <w:rPr>
-          <w:color w:val="1A1A1A"/>
-        </w:rPr>
-        <w:t>●  6. La base de clientes</w:t>
+        <w:t>🔴 6. La base de clientes</w:t>
       </w:r>
     </w:p>
     <w:p>
@@ -357,7 +294,7 @@
     </w:p>
     <w:p>
       <w:pPr>
-        <w:ind w:left="504"/>
+        <w:pStyle w:val="IntenseQuote"/>
       </w:pPr>
       <w:r>
         <w:rPr>
@@ -379,13 +316,10 @@
     </w:p>
     <w:p>
       <w:pPr>
-        <w:pStyle w:val="Heading2"/>
+        <w:pStyle w:val="Heading3"/>
       </w:pPr>
       <w:r>
-        <w:rPr>
-          <w:color w:val="1A1A1A"/>
-        </w:rPr>
-        <w:t>○  7. ¿Hace falta estar cobrado para despachar?</w:t>
+        <w:t>🟡 7. ¿Hace falta estar cobrado para despachar?</w:t>
       </w:r>
     </w:p>
     <w:p>
@@ -395,32 +329,18 @@
     </w:p>
     <w:p>
       <w:pPr>
-        <w:ind w:left="504"/>
+        <w:pStyle w:val="IntenseQuote"/>
       </w:pPr>
       <w:r>
-        <w:rPr>
-          <w:b/>
-        </w:rPr>
-        <w:t>¿El sistema tiene que frenar un despacho si el pedido no está cobrado, o eso lo controla administración por fuera?</w:t>
+        <w:t>**¿El sistema tiene que frenar un despacho si el pedido no está cobrado, o eso lo controla</w:t>
       </w:r>
     </w:p>
     <w:p>
       <w:pPr>
-        <w:jc w:val="center"/>
+        <w:pStyle w:val="IntenseQuote"/>
       </w:pPr>
       <w:r>
-        <w:t>________________________________________________________________________</w:t>
-      </w:r>
-    </w:p>
-    <w:p>
-      <w:pPr>
-        <w:pStyle w:val="Heading1"/>
-      </w:pPr>
-      <w:r>
-        <w:rPr>
-          <w:color w:val="1A1A1A"/>
-        </w:rPr>
-        <w:t>David Orellano — Encargado de producción</w:t>
+        <w:t>administración por fuera?**</w:t>
       </w:r>
     </w:p>
     <w:p>
@@ -428,10 +348,15 @@
         <w:pStyle w:val="Heading2"/>
       </w:pPr>
       <w:r>
-        <w:rPr>
-          <w:color w:val="1A1A1A"/>
-        </w:rPr>
-        <w:t>●  8. Los mínimos y máximos de cada producto</w:t>
+        <w:t>David Orellano — Encargado de producción</w:t>
+      </w:r>
+    </w:p>
+    <w:p>
+      <w:pPr>
+        <w:pStyle w:val="Heading3"/>
+      </w:pPr>
+      <w:r>
+        <w:t>🔴 8. Los mínimos y máximos de cada producto</w:t>
       </w:r>
     </w:p>
     <w:p>
@@ -464,18 +389,28 @@
     </w:p>
     <w:p>
       <w:pPr>
-        <w:ind w:left="504"/>
+        <w:pStyle w:val="IntenseQuote"/>
       </w:pPr>
       <w:r>
-        <w:rPr>
-          <w:b/>
-        </w:rPr>
-        <w:t>Esos valores (500, 1500), ¿son el mínimo que nunca hay que perforar, o son en realidad el objetivo de stock que quieren tener?</w:t>
+        <w:t>**Esos valores (500, 1500), ¿son el mínimo que nunca hay que perforar, o son en realidad el</w:t>
       </w:r>
     </w:p>
     <w:p>
       <w:pPr>
-        <w:ind w:left="504"/>
+        <w:pStyle w:val="IntenseQuote"/>
+      </w:pPr>
+      <w:r>
+        <w:t>objetivo de stock que quieren tener?**</w:t>
+      </w:r>
+    </w:p>
+    <w:p>
+      <w:pPr>
+        <w:pStyle w:val="IntenseQuote"/>
+      </w:pPr>
+    </w:p>
+    <w:p>
+      <w:pPr>
+        <w:pStyle w:val="IntenseQuote"/>
       </w:pPr>
       <w:r>
         <w:rPr>
@@ -491,13 +426,10 @@
     </w:p>
     <w:p>
       <w:pPr>
-        <w:pStyle w:val="Heading2"/>
+        <w:pStyle w:val="Heading3"/>
       </w:pPr>
       <w:r>
-        <w:rPr>
-          <w:color w:val="1A1A1A"/>
-        </w:rPr>
-        <w:t>●  9. Unidades por caja</w:t>
+        <w:t>🔴 9. Unidades por caja</w:t>
       </w:r>
     </w:p>
     <w:p>
@@ -525,13 +457,18 @@
     </w:p>
     <w:p>
       <w:pPr>
-        <w:ind w:left="504"/>
+        <w:pStyle w:val="IntenseQuote"/>
       </w:pPr>
       <w:r>
-        <w:rPr>
-          <w:b/>
-        </w:rPr>
-        <w:t>¿Es siempre así, o varía según el producto? ¿Y los accesorios (bordes, esquineros, rampas) cómo se embalan?</w:t>
+        <w:t>**¿Es siempre así, o varía según el producto? ¿Y los accesorios (bordes, esquineros, rampas)</w:t>
+      </w:r>
+    </w:p>
+    <w:p>
+      <w:pPr>
+        <w:pStyle w:val="IntenseQuote"/>
+      </w:pPr>
+      <w:r>
+        <w:t>cómo se embalan?**</w:t>
       </w:r>
     </w:p>
     <w:p>
@@ -547,13 +484,10 @@
     </w:p>
     <w:p>
       <w:pPr>
-        <w:pStyle w:val="Heading2"/>
+        <w:pStyle w:val="Heading3"/>
       </w:pPr>
       <w:r>
-        <w:rPr>
-          <w:color w:val="1A1A1A"/>
-        </w:rPr>
-        <w:t>○  10. La inyectora de NEXA</w:t>
+        <w:t>🟡 10. La inyectora de NEXA</w:t>
       </w:r>
     </w:p>
     <w:p>
@@ -563,7 +497,7 @@
     </w:p>
     <w:p>
       <w:pPr>
-        <w:ind w:left="504"/>
+        <w:pStyle w:val="IntenseQuote"/>
       </w:pPr>
       <w:r>
         <w:rPr>
@@ -574,32 +508,18 @@
     </w:p>
     <w:p>
       <w:pPr>
-        <w:jc w:val="center"/>
+        <w:pStyle w:val="Heading2"/>
       </w:pPr>
       <w:r>
-        <w:t>________________________________________________________________________</w:t>
-      </w:r>
-    </w:p>
-    <w:p>
-      <w:pPr>
-        <w:pStyle w:val="Heading1"/>
-      </w:pPr>
-      <w:r>
-        <w:rPr>
-          <w:color w:val="1A1A1A"/>
-        </w:rPr>
         <w:t>Daniela Tenorio — Materia prima</w:t>
       </w:r>
     </w:p>
     <w:p>
       <w:pPr>
-        <w:pStyle w:val="Heading2"/>
+        <w:pStyle w:val="Heading3"/>
       </w:pPr>
       <w:r>
-        <w:rPr>
-          <w:color w:val="1A1A1A"/>
-        </w:rPr>
-        <w:t>○  11. Los primeros dígitos del código de barras de materia prima</w:t>
+        <w:t>🟡 11. Los primeros dígitos del código de barras de materia prima</w:t>
       </w:r>
     </w:p>
     <w:p>
@@ -609,13 +529,26 @@
     </w:p>
     <w:p>
       <w:pPr>
-        <w:ind w:left="504"/>
+        <w:pStyle w:val="IntenseQuote"/>
       </w:pPr>
       <w:r>
-        <w:rPr>
-          <w:b/>
-        </w:rPr>
-        <w:t>Los 3 primeros dígitos identifican el producto inyectado. Pero una misma bolsa de materia prima puede usarse para varios productos y colores distintos. ¿Cómo se resuelve eso hoy? ¿Se etiqueta la bolsa pensando en el producto al que está destinada?</w:t>
+        <w:t>**Los 3 primeros dígitos identifican el producto inyectado. Pero una misma bolsa de materia</w:t>
+      </w:r>
+    </w:p>
+    <w:p>
+      <w:pPr>
+        <w:pStyle w:val="IntenseQuote"/>
+      </w:pPr>
+      <w:r>
+        <w:t>prima puede usarse para varios productos y colores distintos. ¿Cómo se resuelve eso hoy? ¿Se</w:t>
+      </w:r>
+    </w:p>
+    <w:p>
+      <w:pPr>
+        <w:pStyle w:val="IntenseQuote"/>
+      </w:pPr>
+      <w:r>
+        <w:t>etiqueta la bolsa pensando en el producto al que está destinada?**</w:t>
       </w:r>
     </w:p>
     <w:p>
@@ -631,20 +564,9 @@
     </w:p>
     <w:p>
       <w:pPr>
-        <w:jc w:val="center"/>
+        <w:pStyle w:val="Heading2"/>
       </w:pPr>
       <w:r>
-        <w:t>________________________________________________________________________</w:t>
-      </w:r>
-    </w:p>
-    <w:p>
-      <w:pPr>
-        <w:pStyle w:val="Heading1"/>
-      </w:pPr>
-      <w:r>
-        <w:rPr>
-          <w:color w:val="1A1A1A"/>
-        </w:rPr>
         <w:t>Qué asumimos mientras tanto</w:t>
       </w:r>
     </w:p>
@@ -682,11 +604,6 @@
               <w:rPr>
                 <w:b/>
               </w:rPr>
-            </w:r>
-            <w:r>
-              <w:rPr>
-                <w:b/>
-              </w:rPr>
               <w:t>Tema</w:t>
             </w:r>
           </w:p>
@@ -696,11 +613,6 @@
             <w:tcW w:type="dxa" w:w="4320"/>
           </w:tcPr>
           <w:p>
-            <w:r>
-              <w:rPr>
-                <w:b/>
-              </w:rPr>
-            </w:r>
             <w:r>
               <w:rPr>
                 <w:b/>
@@ -716,7 +628,6 @@
             <w:tcW w:type="dxa" w:w="4320"/>
           </w:tcPr>
           <w:p>
-            <w:r/>
             <w:r>
               <w:t>Colores</w:t>
             </w:r>
@@ -727,7 +638,6 @@
             <w:tcW w:type="dxa" w:w="4320"/>
           </w:tcPr>
           <w:p>
-            <w:r/>
             <w:r>
               <w:t>La lista de 12 colores que figura en el Excel de cálculo, unificando mayúsculas</w:t>
             </w:r>
@@ -740,7 +650,6 @@
             <w:tcW w:type="dxa" w:w="4320"/>
           </w:tcPr>
           <w:p>
-            <w:r/>
             <w:r>
               <w:t>Pedidos multicolor</w:t>
             </w:r>
@@ -751,7 +660,6 @@
             <w:tcW w:type="dxa" w:w="4320"/>
           </w:tcPr>
           <w:p>
-            <w:r/>
             <w:r>
               <w:t xml:space="preserve">Se cargan como renglón "sin producto asignado", para completar a mano. </w:t>
             </w:r>
@@ -770,7 +678,6 @@
             <w:tcW w:type="dxa" w:w="4320"/>
           </w:tcPr>
           <w:p>
-            <w:r/>
             <w:r>
               <w:t>Unidades por caja</w:t>
             </w:r>
@@ -781,7 +688,6 @@
             <w:tcW w:type="dxa" w:w="4320"/>
           </w:tcPr>
           <w:p>
-            <w:r/>
             <w:r>
               <w:t>Rejilla 8 · Ciego 25</w:t>
             </w:r>
@@ -794,7 +700,6 @@
             <w:tcW w:type="dxa" w:w="4320"/>
           </w:tcPr>
           <w:p>
-            <w:r/>
             <w:r>
               <w:t>Mínimos y máximos</w:t>
             </w:r>
@@ -805,7 +710,6 @@
             <w:tcW w:type="dxa" w:w="4320"/>
           </w:tcPr>
           <w:p>
-            <w:r/>
             <w:r>
               <w:t>Se importan tal cual están, pero el semáforo queda desactivado hasta tener los números reales</w:t>
             </w:r>
@@ -818,7 +722,6 @@
             <w:tcW w:type="dxa" w:w="4320"/>
           </w:tcPr>
           <w:p>
-            <w:r/>
             <w:r>
               <w:t>Clientes</w:t>
             </w:r>
@@ -829,7 +732,6 @@
             <w:tcW w:type="dxa" w:w="4320"/>
           </w:tcPr>
           <w:p>
-            <w:r/>
             <w:r>
               <w:t>Los ~60 del Excel de ventas; el resto se da de alta al usarse</w:t>
             </w:r>
@@ -842,7 +744,6 @@
             <w:tcW w:type="dxa" w:w="4320"/>
           </w:tcPr>
           <w:p>
-            <w:r/>
             <w:r>
               <w:t>Master por kg</w:t>
             </w:r>
@@ -853,7 +754,6 @@
             <w:tcW w:type="dxa" w:w="4320"/>
           </w:tcPr>
           <w:p>
-            <w:r/>
             <w:r>
               <w:t>0,015 kg por kg (el valor del Excel), marcado como provisorio</w:t>
             </w:r>
@@ -861,23 +761,11 @@
         </w:tc>
       </w:tr>
     </w:tbl>
-    <w:p/>
     <w:p>
       <w:pPr>
-        <w:jc w:val="center"/>
+        <w:pStyle w:val="Heading2"/>
       </w:pPr>
       <w:r>
-        <w:t>________________________________________________________________________</w:t>
-      </w:r>
-    </w:p>
-    <w:p>
-      <w:pPr>
-        <w:pStyle w:val="Heading1"/>
-      </w:pPr>
-      <w:r>
-        <w:rPr>
-          <w:color w:val="1A1A1A"/>
-        </w:rPr>
         <w:t>Qué archivos necesitamos</w:t>
       </w:r>
     </w:p>
@@ -901,11 +789,6 @@
               <w:rPr>
                 <w:b/>
               </w:rPr>
-            </w:r>
-            <w:r>
-              <w:rPr>
-                <w:b/>
-              </w:rPr>
               <w:t>Archivo</w:t>
             </w:r>
           </w:p>
@@ -915,11 +798,6 @@
             <w:tcW w:type="dxa" w:w="4320"/>
           </w:tcPr>
           <w:p>
-            <w:r>
-              <w:rPr>
-                <w:b/>
-              </w:rPr>
-            </w:r>
             <w:r>
               <w:rPr>
                 <w:b/>
@@ -935,7 +813,6 @@
             <w:tcW w:type="dxa" w:w="4320"/>
           </w:tcPr>
           <w:p>
-            <w:r/>
             <w:r>
               <w:t xml:space="preserve">Exportación de la </w:t>
             </w:r>
@@ -955,7 +832,6 @@
             <w:tcW w:type="dxa" w:w="4320"/>
           </w:tcPr>
           <w:p>
-            <w:r/>
             <w:r>
               <w:t>Cargar los ~360 clientes con sus datos reales</w:t>
             </w:r>
@@ -968,7 +844,6 @@
             <w:tcW w:type="dxa" w:w="4320"/>
           </w:tcPr>
           <w:p>
-            <w:r/>
             <w:r>
               <w:rPr>
                 <w:b/>
@@ -985,7 +860,6 @@
             <w:tcW w:type="dxa" w:w="4320"/>
           </w:tcPr>
           <w:p>
-            <w:r/>
             <w:r>
               <w:t>Cerrar el catálogo de productos</w:t>
             </w:r>
@@ -998,7 +872,6 @@
             <w:tcW w:type="dxa" w:w="4320"/>
           </w:tcPr>
           <w:p>
-            <w:r/>
             <w:r>
               <w:t xml:space="preserve">Los </w:t>
             </w:r>
@@ -1018,7 +891,6 @@
             <w:tcW w:type="dxa" w:w="4320"/>
           </w:tcPr>
           <w:p>
-            <w:r/>
             <w:r>
               <w:t>Replicar en pantalla exactamente los datos que ya cargan, sin pedir nada de más</w:t>
             </w:r>
@@ -1031,7 +903,6 @@
             <w:tcW w:type="dxa" w:w="4320"/>
           </w:tcPr>
           <w:p>
-            <w:r/>
             <w:r>
               <w:t xml:space="preserve">Un </w:t>
             </w:r>
@@ -1051,7 +922,6 @@
             <w:tcW w:type="dxa" w:w="4320"/>
           </w:tcPr>
           <w:p>
-            <w:r/>
             <w:r>
               <w:t>Ustedes pidieron poder imprimir los remitos sobre sus formularios. Necesitamos las medidas exactas para que la impresión caiga en los casilleros</w:t>
             </w:r>
@@ -1064,7 +934,6 @@
             <w:tcW w:type="dxa" w:w="4320"/>
           </w:tcPr>
           <w:p>
-            <w:r/>
             <w:r>
               <w:t xml:space="preserve">Un </w:t>
             </w:r>
@@ -1084,7 +953,6 @@
             <w:tcW w:type="dxa" w:w="4320"/>
           </w:tcPr>
           <w:p>
-            <w:r/>
             <w:r>
               <w:t>Ver qué datos trae y cómo se numera</w:t>
             </w:r>
@@ -1097,7 +965,6 @@
             <w:tcW w:type="dxa" w:w="4320"/>
           </w:tcPr>
           <w:p>
-            <w:r/>
             <w:r>
               <w:t xml:space="preserve">Una </w:t>
             </w:r>
@@ -1117,7 +984,6 @@
             <w:tcW w:type="dxa" w:w="4320"/>
           </w:tcPr>
           <w:p>
-            <w:r/>
             <w:r>
               <w:t>Replicarla tal cual</w:t>
             </w:r>
@@ -1130,7 +996,6 @@
             <w:tcW w:type="dxa" w:w="4320"/>
           </w:tcPr>
           <w:p>
-            <w:r/>
             <w:r>
               <w:t xml:space="preserve">Una </w:t>
             </w:r>
@@ -1150,7 +1015,6 @@
             <w:tcW w:type="dxa" w:w="4320"/>
           </w:tcPr>
           <w:p>
-            <w:r/>
             <w:r>
               <w:t>Arrancar el sistema con el stock real del día del arranque</w:t>
             </w:r>
@@ -1158,23 +1022,11 @@
         </w:tc>
       </w:tr>
     </w:tbl>
-    <w:p/>
     <w:p>
       <w:pPr>
-        <w:jc w:val="center"/>
+        <w:pStyle w:val="Heading2"/>
       </w:pPr>
       <w:r>
-        <w:t>________________________________________________________________________</w:t>
-      </w:r>
-    </w:p>
-    <w:p>
-      <w:pPr>
-        <w:pStyle w:val="Heading1"/>
-      </w:pPr>
-      <w:r>
-        <w:rPr>
-          <w:color w:val="1A1A1A"/>
-        </w:rPr>
         <w:t>Lo que ya está resuelto</w:t>
       </w:r>
     </w:p>
@@ -1191,15 +1043,24 @@
         <w:rPr>
           <w:b/>
         </w:rPr>
+        <w:t>Número de partida.</w:t>
+      </w:r>
+      <w:r>
+        <w:t xml:space="preserve"> El sistema lo genera solo, correlativo, cada vez que arranca una producción con una combinación nueva de material y color — nunca se tipea a mano.</w:t>
+      </w:r>
+    </w:p>
+    <w:p>
+      <w:pPr>
+        <w:pStyle w:val="ListBullet"/>
+      </w:pPr>
+      <w:r>
+        <w:rPr>
+          <w:b/>
+        </w:rPr>
         <w:t>Carga directa en el sistema.</w:t>
       </w:r>
       <w:r>
-        <w:t xml:space="preserve"> Ya confirmado: las vendedoras van a cargar el pedido acá,</w:t>
-      </w:r>
-    </w:p>
-    <w:p>
-      <w:r>
-        <w:t>no seguimos con el Excel. Así está construido desde ahora.</w:t>
+        <w:t xml:space="preserve"> Ya confirmado: las vendedoras van a cargar el pedido acá, no seguimos con el Excel. Así está construido desde ahora.</w:t>
       </w:r>
     </w:p>
     <w:p>
@@ -1213,12 +1074,7 @@
         <w:t>Estados del pedido y despacho parcial.</w:t>
       </w:r>
       <w:r>
-        <w:t xml:space="preserve"> Tomamos el pedido de poder despachar una parte</w:t>
-      </w:r>
-    </w:p>
-    <w:p>
-      <w:r>
-        <w:t>(por ejemplo, que se lleven los pisos y queden las rampas para la semana siguiente). El pedido queda abierto con lo que falta.</w:t>
+        <w:t xml:space="preserve"> Tomamos el pedido de poder despachar una parte (por ejemplo, que se lleven los pisos y queden las rampas para la semana siguiente). El pedido queda abierto con lo que falta.</w:t>
       </w:r>
     </w:p>
     <w:p>
@@ -1232,12 +1088,7 @@
         <w:t>Doble piqueo.</w:t>
       </w:r>
       <w:r>
-        <w:t xml:space="preserve"> Se van a registrar los dos controles que pidieron: uno al pasar de armado a</w:t>
-      </w:r>
-    </w:p>
-    <w:p>
-      <w:r>
-        <w:t>despacho, y otro en el control final. Queda registro de quién, cuándo y qué.</w:t>
+        <w:t xml:space="preserve"> Se van a registrar los dos controles que pidieron: uno al pasar de armado a despacho, y otro en el control final. Queda registro de quién, cuándo y qué.</w:t>
       </w:r>
     </w:p>
     <w:p>
@@ -1265,12 +1116,7 @@
         <w:t>Trazabilidad completa.</w:t>
       </w:r>
       <w:r>
-        <w:t xml:space="preserve"> Desde el certificado de calidad del proveedor hasta la caja que</w:t>
-      </w:r>
-    </w:p>
-    <w:p>
-      <w:r>
-        <w:t>recibió el cliente, en los dos sentidos: dado un reclamo, qué lote se usó; y dado un lote fallado, qué cajas salieron y a qué clientes.</w:t>
+        <w:t xml:space="preserve"> Desde el certificado de calidad del proveedor hasta la caja que recibió el cliente, en los dos sentidos: dado un reclamo, qué lote se usó; y dado un lote fallado, qué cajas salieron y a qué clientes.</w:t>
       </w:r>
     </w:p>
     <w:p>
@@ -1284,12 +1130,7 @@
         <w:t>Roles.</w:t>
       </w:r>
       <w:r>
-        <w:t xml:space="preserve"> Se respetan los del procedimiento firmado, con la regla de que de supervisor para</w:t>
-      </w:r>
-    </w:p>
-    <w:p>
-      <w:r>
-        <w:t>abajo nadie ve precios.</w:t>
+        <w:t xml:space="preserve"> Se respetan los del procedimiento firmado, con la regla de que de supervisor para abajo nadie ve precios.</w:t>
       </w:r>
     </w:p>
     <w:p>
@@ -1303,12 +1144,7 @@
         <w:t>Carga de producción por día.</w:t>
       </w:r>
       <w:r>
-        <w:t xml:space="preserve"> El operario cierra el ciclo al final de cada jornada, aunque</w:t>
-      </w:r>
-    </w:p>
-    <w:p>
-      <w:r>
-        <w:t>siga con el mismo color al día siguiente — así la colada, el descarte y el consumo de material salen por día, como pidieron. No se pierde la continuidad: el día siguiente arranca desde donde quedó el anterior, y los dos quedan bajo la misma partida.</w:t>
+        <w:t xml:space="preserve"> El operario cierra el ciclo al final de cada jornada, aunque siga con el mismo color al día siguiente — así la colada, el descarte y el consumo de material salen por día, como pidieron. No se pierde la continuidad: el día siguiente arranca desde donde quedó el anterior, y los dos quedan bajo la misma partida.</w:t>
       </w:r>
     </w:p>
     <w:sectPr>
@@ -1684,11 +1520,7 @@
     <w:name w:val="Normal"/>
     <w:qFormat/>
     <w:rsid w:val="00FC693F"/>
-    <w:pPr>
-      <w:spacing w:after="120"/>
-    </w:pPr>
     <w:rPr>
-      <w:rFonts w:ascii="Calibri" w:hAnsi="Calibri"/>
       <w:sz w:val="21"/>
     </w:rPr>
   </w:style>

</xml_diff>

<commit_message>
Sube la pregunta de la inyectora a bloqueante
Ya no es una duda de negocio en abstracto: la pantalla de alta de ciclo de
Producción la pide en cada carga y hoy se escribe a mano por no tener una
lista fija.

Co-Authored-By: Claude Sonnet 5 <noreply@anthropic.com>
</commit_message>
<xml_diff>
--- a/docs/entregables/NEXA - Definiciones pendientes.docx
+++ b/docs/entregables/NEXA - Definiciones pendientes.docx
@@ -487,12 +487,12 @@
         <w:pStyle w:val="Heading3"/>
       </w:pPr>
       <w:r>
-        <w:t>🟡 10. La inyectora de NEXA</w:t>
+        <w:t>🔴 10. La inyectora de NEXA</w:t>
       </w:r>
     </w:p>
     <w:p>
       <w:r>
-        <w:t>En el histórico de producción aparecen las inyectoras 6 y 8, pero entendemos que NEXA trabaja con una sola.</w:t>
+        <w:t>En el histórico de producción aparecen las inyectoras 6 y 8, pero entendemos que NEXA trabaja con una sola. Pasa a ser urgente porque ya está en uso: la pantalla de alta de ciclo de producción pide indicarla en cada carga, y hoy se escribe a mano por no tener una lista fija.</w:t>
       </w:r>
     </w:p>
     <w:p>

</xml_diff>